<commit_message>
Début du rapport de projet
- présentation globale du projet
- choix effectuer
- intégration continue et suivit de projet
</commit_message>
<xml_diff>
--- a/Rapport-Projet-Capi.docx
+++ b/Rapport-Projet-Capi.docx
@@ -2,7 +2,797 @@
 <file path=word/document.xml><?xml version="1.0" encoding="utf-8"?>
 <w:document xmlns:wpc="http://schemas.microsoft.com/office/word/2010/wordprocessingCanvas" xmlns:cx="http://schemas.microsoft.com/office/drawing/2014/chartex" xmlns:cx1="http://schemas.microsoft.com/office/drawing/2015/9/8/chartex" xmlns:cx2="http://schemas.microsoft.com/office/drawing/2015/10/21/chartex" xmlns:cx3="http://schemas.microsoft.com/office/drawing/2016/5/9/chartex" xmlns:cx4="http://schemas.microsoft.com/office/drawing/2016/5/10/chartex" xmlns:cx5="http://schemas.microsoft.com/office/drawing/2016/5/11/chartex" xmlns:cx6="http://schemas.microsoft.com/office/drawing/2016/5/12/chartex" xmlns:cx7="http://schemas.microsoft.com/office/drawing/2016/5/13/chartex" xmlns:cx8="http://schemas.microsoft.com/office/drawing/2016/5/14/chartex" xmlns:mc="http://schemas.openxmlformats.org/markup-compatibility/2006" xmlns:aink="http://schemas.microsoft.com/office/drawing/2016/ink" xmlns:am3d="http://schemas.microsoft.com/office/drawing/2017/model3d" xmlns:o="urn:schemas-microsoft-com:office:office" xmlns:r="http://schemas.openxmlformats.org/officeDocument/2006/relationships" xmlns:m="http://schemas.openxmlformats.org/officeDocument/2006/math" xmlns:v="urn:schemas-microsoft-com:vml" xmlns:wp14="http://schemas.microsoft.com/office/word/2010/wordprocessingDrawing" xmlns:wp="http://schemas.openxmlformats.org/drawingml/2006/wordprocessingDrawing" xmlns:w10="urn:schemas-microsoft-com:office:word" xmlns:w="http://schemas.openxmlformats.org/wordprocessingml/2006/main" xmlns:w14="http://schemas.microsoft.com/office/word/2010/wordml" xmlns:w15="http://schemas.microsoft.com/office/word/2012/wordml" xmlns:w16cex="http://schemas.microsoft.com/office/word/2018/wordml/cex" xmlns:w16cid="http://schemas.microsoft.com/office/word/2016/wordml/cid" xmlns:w16="http://schemas.microsoft.com/office/word/2018/wordml" xmlns:w16sdtdh="http://schemas.microsoft.com/office/word/2020/wordml/sdtdatahash" xmlns:w16se="http://schemas.microsoft.com/office/word/2015/wordml/symex" xmlns:wpg="http://schemas.microsoft.com/office/word/2010/wordprocessingGroup" xmlns:wpi="http://schemas.microsoft.com/office/word/2010/wordprocessingInk" xmlns:wne="http://schemas.microsoft.com/office/word/2006/wordml" xmlns:wps="http://schemas.microsoft.com/office/word/2010/wordprocessingShape" mc:Ignorable="w14 w15 w16se w16cid w16 w16cex w16sdtdh wp14">
   <w:body>
-    <w:p/>
+    <w:p>
+      <w:pPr>
+        <w:jc w:val="center"/>
+        <w:rPr>
+          <w:rFonts w:ascii="Calibri" w:hAnsi="Calibri" w:cs="Calibri"/>
+          <w:b/>
+          <w:bCs/>
+          <w:sz w:val="44"/>
+          <w:szCs w:val="44"/>
+        </w:rPr>
+      </w:pPr>
+      <w:r>
+        <w:rPr>
+          <w:rFonts w:ascii="Calibri" w:hAnsi="Calibri" w:cs="Calibri"/>
+          <w:b/>
+          <w:bCs/>
+          <w:sz w:val="44"/>
+          <w:szCs w:val="44"/>
+        </w:rPr>
+        <w:t xml:space="preserve">Projet </w:t>
+      </w:r>
+      <w:r>
+        <w:rPr>
+          <w:rFonts w:ascii="Calibri" w:hAnsi="Calibri" w:cs="Calibri"/>
+          <w:b/>
+          <w:bCs/>
+          <w:sz w:val="44"/>
+          <w:szCs w:val="44"/>
+        </w:rPr>
+        <w:t>CAPI</w:t>
+      </w:r>
+    </w:p>
+    <w:p>
+      <w:pPr>
+        <w:rPr>
+          <w:rFonts w:ascii="Calibri" w:hAnsi="Calibri" w:cs="Calibri"/>
+          <w:sz w:val="24"/>
+          <w:szCs w:val="24"/>
+        </w:rPr>
+      </w:pPr>
+      <w:r>
+        <w:rPr>
+          <w:rFonts w:ascii="Calibri" w:hAnsi="Calibri" w:cs="Calibri"/>
+          <w:sz w:val="24"/>
+          <w:szCs w:val="24"/>
+        </w:rPr>
+        <w:t>[</w:t>
+      </w:r>
+      <w:r>
+        <w:rPr>
+          <w:rFonts w:ascii="Calibri" w:hAnsi="Calibri" w:cs="Calibri"/>
+          <w:sz w:val="24"/>
+          <w:szCs w:val="24"/>
+        </w:rPr>
+        <w:t xml:space="preserve">Présentation globale du </w:t>
+      </w:r>
+      <w:r>
+        <w:rPr>
+          <w:rFonts w:ascii="Calibri" w:hAnsi="Calibri" w:cs="Calibri"/>
+          <w:sz w:val="24"/>
+          <w:szCs w:val="24"/>
+        </w:rPr>
+        <w:t>projet]</w:t>
+      </w:r>
+    </w:p>
+    <w:p>
+      <w:pPr>
+        <w:rPr>
+          <w:rFonts w:ascii="Calibri" w:hAnsi="Calibri" w:cs="Calibri"/>
+          <w:sz w:val="24"/>
+          <w:szCs w:val="24"/>
+        </w:rPr>
+      </w:pPr>
+      <w:r>
+        <w:rPr>
+          <w:rFonts w:ascii="Calibri" w:hAnsi="Calibri" w:cs="Calibri"/>
+          <w:sz w:val="24"/>
+          <w:szCs w:val="24"/>
+        </w:rPr>
+        <w:t>Le projet se portera sur la création d’une application</w:t>
+      </w:r>
+      <w:r>
+        <w:rPr>
+          <w:rFonts w:ascii="Calibri" w:hAnsi="Calibri" w:cs="Calibri"/>
+          <w:sz w:val="24"/>
+          <w:szCs w:val="24"/>
+        </w:rPr>
+        <w:t xml:space="preserve"> locale</w:t>
+      </w:r>
+      <w:r>
+        <w:rPr>
+          <w:rFonts w:ascii="Calibri" w:hAnsi="Calibri" w:cs="Calibri"/>
+          <w:sz w:val="24"/>
+          <w:szCs w:val="24"/>
+        </w:rPr>
+        <w:t xml:space="preserve"> de planning poker.</w:t>
+      </w:r>
+      <w:r>
+        <w:rPr>
+          <w:rFonts w:ascii="Calibri" w:hAnsi="Calibri" w:cs="Calibri"/>
+          <w:sz w:val="24"/>
+          <w:szCs w:val="24"/>
+        </w:rPr>
+        <w:t xml:space="preserve"> </w:t>
+      </w:r>
+      <w:r>
+        <w:rPr>
+          <w:rFonts w:ascii="Calibri" w:hAnsi="Calibri" w:cs="Calibri"/>
+          <w:sz w:val="24"/>
+          <w:szCs w:val="24"/>
+        </w:rPr>
+        <w:t>L’application intègrera plusieurs modes de jeux :</w:t>
+      </w:r>
+    </w:p>
+    <w:p>
+      <w:pPr>
+        <w:numPr>
+          <w:ilvl w:val="0"/>
+          <w:numId w:val="1"/>
+        </w:numPr>
+        <w:shd w:val="clear" w:color="auto" w:fill="FFFFFF"/>
+        <w:spacing w:before="100" w:beforeAutospacing="1" w:after="100" w:afterAutospacing="1" w:line="240" w:lineRule="auto"/>
+        <w:rPr>
+          <w:rFonts w:ascii="Calibri" w:eastAsia="Times New Roman" w:hAnsi="Calibri" w:cs="Calibri"/>
+          <w:color w:val="1D2125"/>
+          <w:sz w:val="24"/>
+          <w:szCs w:val="24"/>
+          <w:lang w:eastAsia="fr-FR"/>
+        </w:rPr>
+      </w:pPr>
+      <w:r>
+        <w:rPr>
+          <w:rFonts w:ascii="Calibri" w:eastAsia="Times New Roman" w:hAnsi="Calibri" w:cs="Calibri"/>
+          <w:color w:val="1D2125"/>
+          <w:sz w:val="24"/>
+          <w:szCs w:val="24"/>
+          <w:lang w:eastAsia="fr-FR"/>
+        </w:rPr>
+        <w:t>Strict (mode de base)</w:t>
+      </w:r>
+    </w:p>
+    <w:p>
+      <w:pPr>
+        <w:numPr>
+          <w:ilvl w:val="0"/>
+          <w:numId w:val="1"/>
+        </w:numPr>
+        <w:shd w:val="clear" w:color="auto" w:fill="FFFFFF"/>
+        <w:spacing w:before="100" w:beforeAutospacing="1" w:after="100" w:afterAutospacing="1" w:line="240" w:lineRule="auto"/>
+        <w:rPr>
+          <w:rFonts w:ascii="Calibri" w:eastAsia="Times New Roman" w:hAnsi="Calibri" w:cs="Calibri"/>
+          <w:color w:val="1D2125"/>
+          <w:sz w:val="24"/>
+          <w:szCs w:val="24"/>
+          <w:lang w:eastAsia="fr-FR"/>
+        </w:rPr>
+      </w:pPr>
+      <w:r>
+        <w:rPr>
+          <w:rFonts w:ascii="Calibri" w:eastAsia="Times New Roman" w:hAnsi="Calibri" w:cs="Calibri"/>
+          <w:color w:val="1D2125"/>
+          <w:sz w:val="24"/>
+          <w:szCs w:val="24"/>
+          <w:lang w:eastAsia="fr-FR"/>
+        </w:rPr>
+        <w:t>Moyenne</w:t>
+      </w:r>
+    </w:p>
+    <w:p>
+      <w:pPr>
+        <w:numPr>
+          <w:ilvl w:val="0"/>
+          <w:numId w:val="1"/>
+        </w:numPr>
+        <w:shd w:val="clear" w:color="auto" w:fill="FFFFFF"/>
+        <w:spacing w:before="100" w:beforeAutospacing="1" w:after="100" w:afterAutospacing="1" w:line="240" w:lineRule="auto"/>
+        <w:rPr>
+          <w:rFonts w:ascii="Calibri" w:eastAsia="Times New Roman" w:hAnsi="Calibri" w:cs="Calibri"/>
+          <w:color w:val="1D2125"/>
+          <w:sz w:val="24"/>
+          <w:szCs w:val="24"/>
+          <w:lang w:eastAsia="fr-FR"/>
+        </w:rPr>
+      </w:pPr>
+      <w:r>
+        <w:rPr>
+          <w:rFonts w:ascii="Calibri" w:eastAsia="Times New Roman" w:hAnsi="Calibri" w:cs="Calibri"/>
+          <w:color w:val="1D2125"/>
+          <w:sz w:val="24"/>
+          <w:szCs w:val="24"/>
+          <w:lang w:eastAsia="fr-FR"/>
+        </w:rPr>
+        <w:t>Médiane</w:t>
+      </w:r>
+    </w:p>
+    <w:p>
+      <w:pPr>
+        <w:numPr>
+          <w:ilvl w:val="0"/>
+          <w:numId w:val="1"/>
+        </w:numPr>
+        <w:shd w:val="clear" w:color="auto" w:fill="FFFFFF"/>
+        <w:spacing w:before="100" w:beforeAutospacing="1" w:after="100" w:afterAutospacing="1" w:line="240" w:lineRule="auto"/>
+        <w:rPr>
+          <w:rFonts w:ascii="Calibri" w:eastAsia="Times New Roman" w:hAnsi="Calibri" w:cs="Calibri"/>
+          <w:color w:val="1D2125"/>
+          <w:sz w:val="24"/>
+          <w:szCs w:val="24"/>
+          <w:lang w:eastAsia="fr-FR"/>
+        </w:rPr>
+      </w:pPr>
+      <w:r>
+        <w:rPr>
+          <w:rFonts w:ascii="Calibri" w:eastAsia="Times New Roman" w:hAnsi="Calibri" w:cs="Calibri"/>
+          <w:color w:val="1D2125"/>
+          <w:sz w:val="24"/>
+          <w:szCs w:val="24"/>
+          <w:lang w:eastAsia="fr-FR"/>
+        </w:rPr>
+        <w:t>Majorité absolue</w:t>
+      </w:r>
+    </w:p>
+    <w:p>
+      <w:pPr>
+        <w:numPr>
+          <w:ilvl w:val="0"/>
+          <w:numId w:val="1"/>
+        </w:numPr>
+        <w:shd w:val="clear" w:color="auto" w:fill="FFFFFF"/>
+        <w:spacing w:before="100" w:beforeAutospacing="1" w:after="100" w:afterAutospacing="1" w:line="240" w:lineRule="auto"/>
+        <w:rPr>
+          <w:rFonts w:ascii="Calibri" w:eastAsia="Times New Roman" w:hAnsi="Calibri" w:cs="Calibri"/>
+          <w:color w:val="1D2125"/>
+          <w:sz w:val="24"/>
+          <w:szCs w:val="24"/>
+          <w:lang w:eastAsia="fr-FR"/>
+        </w:rPr>
+      </w:pPr>
+      <w:r>
+        <w:rPr>
+          <w:rFonts w:ascii="Calibri" w:eastAsia="Times New Roman" w:hAnsi="Calibri" w:cs="Calibri"/>
+          <w:color w:val="1D2125"/>
+          <w:sz w:val="24"/>
+          <w:szCs w:val="24"/>
+          <w:lang w:eastAsia="fr-FR"/>
+        </w:rPr>
+        <w:t>Majorité relative</w:t>
+      </w:r>
+    </w:p>
+    <w:p>
+      <w:pPr>
+        <w:shd w:val="clear" w:color="auto" w:fill="FFFFFF"/>
+        <w:spacing w:before="100" w:beforeAutospacing="1" w:after="100" w:afterAutospacing="1" w:line="240" w:lineRule="auto"/>
+        <w:rPr>
+          <w:rFonts w:ascii="Calibri" w:hAnsi="Calibri" w:cs="Calibri"/>
+          <w:color w:val="1D2125"/>
+          <w:sz w:val="24"/>
+          <w:szCs w:val="24"/>
+          <w:shd w:val="clear" w:color="auto" w:fill="FFFFFF"/>
+        </w:rPr>
+      </w:pPr>
+      <w:r>
+        <w:rPr>
+          <w:rFonts w:ascii="Calibri" w:eastAsia="Times New Roman" w:hAnsi="Calibri" w:cs="Calibri"/>
+          <w:color w:val="1D2125"/>
+          <w:sz w:val="24"/>
+          <w:szCs w:val="24"/>
+          <w:lang w:eastAsia="fr-FR"/>
+        </w:rPr>
+        <w:t>Cependant les autres modes de jeux (hors mode strict) auront obligatoirement un tour 1 à l’unanimité comme dans le mode strict.</w:t>
+      </w:r>
+      <w:r>
+        <w:rPr>
+          <w:rFonts w:ascii="Segoe UI" w:hAnsi="Segoe UI" w:cs="Segoe UI"/>
+          <w:color w:val="1D2125"/>
+          <w:sz w:val="23"/>
+          <w:szCs w:val="23"/>
+          <w:shd w:val="clear" w:color="auto" w:fill="FFFFFF"/>
+        </w:rPr>
+        <w:t xml:space="preserve"> </w:t>
+      </w:r>
+      <w:r>
+        <w:rPr>
+          <w:rFonts w:ascii="Calibri" w:hAnsi="Calibri" w:cs="Calibri"/>
+          <w:color w:val="1D2125"/>
+          <w:sz w:val="24"/>
+          <w:szCs w:val="24"/>
+          <w:shd w:val="clear" w:color="auto" w:fill="FFFFFF"/>
+        </w:rPr>
+        <w:t>Ce choix permet d'avoir au moins un temps de discussion si les joueurs ne sont pas d'acco</w:t>
+      </w:r>
+      <w:r>
+        <w:rPr>
+          <w:rFonts w:ascii="Calibri" w:hAnsi="Calibri" w:cs="Calibri"/>
+          <w:color w:val="1D2125"/>
+          <w:sz w:val="24"/>
+          <w:szCs w:val="24"/>
+          <w:shd w:val="clear" w:color="auto" w:fill="FFFFFF"/>
+        </w:rPr>
+        <w:t>rd.</w:t>
+      </w:r>
+    </w:p>
+    <w:p>
+      <w:pPr>
+        <w:shd w:val="clear" w:color="auto" w:fill="FFFFFF"/>
+        <w:spacing w:before="100" w:beforeAutospacing="1" w:after="100" w:afterAutospacing="1" w:line="240" w:lineRule="auto"/>
+        <w:rPr>
+          <w:rFonts w:ascii="Calibri" w:eastAsia="Times New Roman" w:hAnsi="Calibri" w:cs="Calibri"/>
+          <w:color w:val="1D2125"/>
+          <w:sz w:val="24"/>
+          <w:szCs w:val="24"/>
+          <w:lang w:eastAsia="fr-FR"/>
+        </w:rPr>
+      </w:pPr>
+      <w:r>
+        <w:rPr>
+          <w:rFonts w:ascii="Calibri" w:eastAsia="Times New Roman" w:hAnsi="Calibri" w:cs="Calibri"/>
+          <w:color w:val="1D2125"/>
+          <w:sz w:val="24"/>
+          <w:szCs w:val="24"/>
+          <w:lang w:eastAsia="fr-FR"/>
+        </w:rPr>
+        <w:t>Pour ce qui concerne les tâches présente dans l’application nous avons réutilisés les tâches du TD sur la méthodologie planning poker mise ci-dessous :</w:t>
+      </w:r>
+    </w:p>
+    <w:p>
+      <w:pPr>
+        <w:shd w:val="clear" w:color="auto" w:fill="FFFFFF"/>
+        <w:spacing w:before="100" w:beforeAutospacing="1" w:after="100" w:afterAutospacing="1" w:line="240" w:lineRule="auto"/>
+        <w:rPr>
+          <w:rFonts w:ascii="Calibri" w:eastAsia="Times New Roman" w:hAnsi="Calibri" w:cs="Calibri"/>
+          <w:color w:val="1D2125"/>
+          <w:sz w:val="24"/>
+          <w:szCs w:val="24"/>
+          <w:lang w:eastAsia="fr-FR"/>
+        </w:rPr>
+      </w:pPr>
+      <w:r>
+        <w:rPr>
+          <w:rFonts w:ascii="Calibri" w:eastAsia="Times New Roman" w:hAnsi="Calibri" w:cs="Calibri"/>
+          <w:color w:val="1D2125"/>
+          <w:sz w:val="24"/>
+          <w:szCs w:val="24"/>
+          <w:lang w:eastAsia="fr-FR"/>
+        </w:rPr>
+        <w:drawing>
+          <wp:inline distT="0" distB="0" distL="0" distR="0" wp14:anchorId="5B43C483" wp14:editId="02CA34A1">
+            <wp:extent cx="4511929" cy="2038350"/>
+            <wp:effectExtent l="0" t="0" r="3175" b="0"/>
+            <wp:docPr id="1" name="Image 1"/>
+            <wp:cNvGraphicFramePr>
+              <a:graphicFrameLocks xmlns:a="http://schemas.openxmlformats.org/drawingml/2006/main" noChangeAspect="1"/>
+            </wp:cNvGraphicFramePr>
+            <a:graphic xmlns:a="http://schemas.openxmlformats.org/drawingml/2006/main">
+              <a:graphicData uri="http://schemas.openxmlformats.org/drawingml/2006/picture">
+                <pic:pic xmlns:pic="http://schemas.openxmlformats.org/drawingml/2006/picture">
+                  <pic:nvPicPr>
+                    <pic:cNvPr id="1" name=""/>
+                    <pic:cNvPicPr/>
+                  </pic:nvPicPr>
+                  <pic:blipFill rotWithShape="1">
+                    <a:blip r:embed="rId5"/>
+                    <a:srcRect r="40807"/>
+                    <a:stretch/>
+                  </pic:blipFill>
+                  <pic:spPr bwMode="auto">
+                    <a:xfrm>
+                      <a:off x="0" y="0"/>
+                      <a:ext cx="4540747" cy="2051369"/>
+                    </a:xfrm>
+                    <a:prstGeom prst="rect">
+                      <a:avLst/>
+                    </a:prstGeom>
+                    <a:ln>
+                      <a:noFill/>
+                    </a:ln>
+                    <a:extLst>
+                      <a:ext uri="{53640926-AAD7-44D8-BBD7-CCE9431645EC}">
+                        <a14:shadowObscured xmlns:a14="http://schemas.microsoft.com/office/drawing/2010/main"/>
+                      </a:ext>
+                    </a:extLst>
+                  </pic:spPr>
+                </pic:pic>
+              </a:graphicData>
+            </a:graphic>
+          </wp:inline>
+        </w:drawing>
+      </w:r>
+    </w:p>
+    <w:p>
+      <w:pPr>
+        <w:shd w:val="clear" w:color="auto" w:fill="FFFFFF"/>
+        <w:spacing w:before="100" w:beforeAutospacing="1" w:after="100" w:afterAutospacing="1" w:line="240" w:lineRule="auto"/>
+        <w:rPr>
+          <w:rFonts w:ascii="Calibri" w:eastAsia="Times New Roman" w:hAnsi="Calibri" w:cs="Calibri"/>
+          <w:color w:val="1D2125"/>
+          <w:sz w:val="24"/>
+          <w:szCs w:val="24"/>
+          <w:lang w:eastAsia="fr-FR"/>
+        </w:rPr>
+      </w:pPr>
+      <w:r>
+        <w:rPr>
+          <w:rFonts w:ascii="Calibri" w:eastAsia="Times New Roman" w:hAnsi="Calibri" w:cs="Calibri"/>
+          <w:color w:val="1D2125"/>
+          <w:sz w:val="24"/>
+          <w:szCs w:val="24"/>
+          <w:lang w:eastAsia="fr-FR"/>
+        </w:rPr>
+        <w:drawing>
+          <wp:inline distT="0" distB="0" distL="0" distR="0" wp14:anchorId="256D4272" wp14:editId="6200F7FB">
+            <wp:extent cx="3017442" cy="2200275"/>
+            <wp:effectExtent l="0" t="0" r="0" b="0"/>
+            <wp:docPr id="2" name="Image 2"/>
+            <wp:cNvGraphicFramePr>
+              <a:graphicFrameLocks xmlns:a="http://schemas.openxmlformats.org/drawingml/2006/main" noChangeAspect="1"/>
+            </wp:cNvGraphicFramePr>
+            <a:graphic xmlns:a="http://schemas.openxmlformats.org/drawingml/2006/main">
+              <a:graphicData uri="http://schemas.openxmlformats.org/drawingml/2006/picture">
+                <pic:pic xmlns:pic="http://schemas.openxmlformats.org/drawingml/2006/picture">
+                  <pic:nvPicPr>
+                    <pic:cNvPr id="1" name=""/>
+                    <pic:cNvPicPr/>
+                  </pic:nvPicPr>
+                  <pic:blipFill rotWithShape="1">
+                    <a:blip r:embed="rId5"/>
+                    <a:srcRect l="63327"/>
+                    <a:stretch/>
+                  </pic:blipFill>
+                  <pic:spPr bwMode="auto">
+                    <a:xfrm>
+                      <a:off x="0" y="0"/>
+                      <a:ext cx="3036908" cy="2214469"/>
+                    </a:xfrm>
+                    <a:prstGeom prst="rect">
+                      <a:avLst/>
+                    </a:prstGeom>
+                    <a:ln>
+                      <a:noFill/>
+                    </a:ln>
+                    <a:extLst>
+                      <a:ext uri="{53640926-AAD7-44D8-BBD7-CCE9431645EC}">
+                        <a14:shadowObscured xmlns:a14="http://schemas.microsoft.com/office/drawing/2010/main"/>
+                      </a:ext>
+                    </a:extLst>
+                  </pic:spPr>
+                </pic:pic>
+              </a:graphicData>
+            </a:graphic>
+          </wp:inline>
+        </w:drawing>
+      </w:r>
+    </w:p>
+    <w:p>
+      <w:pPr>
+        <w:rPr>
+          <w:rFonts w:ascii="Calibri" w:hAnsi="Calibri" w:cs="Calibri"/>
+        </w:rPr>
+      </w:pPr>
+      <w:r>
+        <w:rPr>
+          <w:rFonts w:ascii="Calibri" w:hAnsi="Calibri" w:cs="Calibri"/>
+        </w:rPr>
+        <w:t>Au début d’une partie le mode de jeu est stocké dans un</w:t>
+      </w:r>
+      <w:r>
+        <w:rPr>
+          <w:rFonts w:ascii="Calibri" w:hAnsi="Calibri" w:cs="Calibri"/>
+        </w:rPr>
+        <w:t xml:space="preserve"> fichier JSON</w:t>
+      </w:r>
+      <w:r>
+        <w:rPr>
+          <w:rFonts w:ascii="Calibri" w:hAnsi="Calibri" w:cs="Calibri"/>
+        </w:rPr>
+        <w:t xml:space="preserve">. Le fichier est actualisé à chaque fin de tâche en stockant le choix validé de la tâche dans le JSON puis à la fin d’une session de jeu, le JSON </w:t>
+      </w:r>
+      <w:r>
+        <w:rPr>
+          <w:rFonts w:ascii="Calibri" w:hAnsi="Calibri" w:cs="Calibri"/>
+        </w:rPr>
+        <w:t>comportera</w:t>
+      </w:r>
+      <w:r>
+        <w:rPr>
+          <w:rFonts w:ascii="Calibri" w:hAnsi="Calibri" w:cs="Calibri"/>
+        </w:rPr>
+        <w:t xml:space="preserve"> le mode de jeu plus</w:t>
+      </w:r>
+      <w:r>
+        <w:rPr>
+          <w:rFonts w:ascii="Calibri" w:hAnsi="Calibri" w:cs="Calibri"/>
+        </w:rPr>
+        <w:t xml:space="preserve"> l’intégralité</w:t>
+      </w:r>
+      <w:r>
+        <w:rPr>
+          <w:rFonts w:ascii="Calibri" w:hAnsi="Calibri" w:cs="Calibri"/>
+        </w:rPr>
+        <w:t xml:space="preserve"> des choix validé par tâche</w:t>
+      </w:r>
+      <w:r>
+        <w:rPr>
+          <w:rFonts w:ascii="Calibri" w:hAnsi="Calibri" w:cs="Calibri"/>
+        </w:rPr>
+        <w:t xml:space="preserve"> d</w:t>
+      </w:r>
+      <w:r>
+        <w:rPr>
+          <w:rFonts w:ascii="Calibri" w:hAnsi="Calibri" w:cs="Calibri"/>
+        </w:rPr>
+        <w:t>’une partie</w:t>
+      </w:r>
+      <w:r>
+        <w:rPr>
+          <w:rFonts w:ascii="Calibri" w:hAnsi="Calibri" w:cs="Calibri"/>
+        </w:rPr>
+        <w:t>.</w:t>
+      </w:r>
+    </w:p>
+    <w:p>
+      <w:pPr>
+        <w:rPr>
+          <w:rFonts w:ascii="Calibri" w:hAnsi="Calibri" w:cs="Calibri"/>
+        </w:rPr>
+      </w:pPr>
+      <w:r>
+        <w:rPr>
+          <w:rFonts w:ascii="Calibri" w:hAnsi="Calibri" w:cs="Calibri"/>
+        </w:rPr>
+        <w:lastRenderedPageBreak/>
+        <w:t>[</w:t>
+      </w:r>
+      <w:r>
+        <w:rPr>
+          <w:rFonts w:ascii="Calibri" w:hAnsi="Calibri" w:cs="Calibri"/>
+        </w:rPr>
+        <w:t>Choix effectuer (et pourquoi) (ajouter des diagrammes pour préciser et expliquer)</w:t>
+      </w:r>
+      <w:r>
+        <w:rPr>
+          <w:rFonts w:ascii="Calibri" w:hAnsi="Calibri" w:cs="Calibri"/>
+        </w:rPr>
+        <w:t>]</w:t>
+      </w:r>
+    </w:p>
+    <w:p>
+      <w:pPr>
+        <w:rPr>
+          <w:rFonts w:ascii="Calibri" w:hAnsi="Calibri" w:cs="Calibri"/>
+        </w:rPr>
+      </w:pPr>
+    </w:p>
+    <w:p>
+      <w:pPr>
+        <w:rPr>
+          <w:rFonts w:ascii="Calibri" w:hAnsi="Calibri" w:cs="Calibri"/>
+        </w:rPr>
+      </w:pPr>
+      <w:r>
+        <w:rPr>
+          <w:rFonts w:ascii="Calibri" w:hAnsi="Calibri" w:cs="Calibri"/>
+        </w:rPr>
+        <w:t xml:space="preserve">Choix du langage : Python avec l’utilisation de </w:t>
+      </w:r>
+      <w:proofErr w:type="spellStart"/>
+      <w:r>
+        <w:rPr>
+          <w:rFonts w:ascii="Calibri" w:hAnsi="Calibri" w:cs="Calibri"/>
+        </w:rPr>
+        <w:t>tkinter</w:t>
+      </w:r>
+      <w:proofErr w:type="spellEnd"/>
+      <w:r>
+        <w:rPr>
+          <w:rFonts w:ascii="Calibri" w:hAnsi="Calibri" w:cs="Calibri"/>
+        </w:rPr>
+        <w:t xml:space="preserve"> </w:t>
+      </w:r>
+      <w:r>
+        <w:rPr>
+          <w:rFonts w:ascii="Calibri" w:hAnsi="Calibri" w:cs="Calibri"/>
+        </w:rPr>
+        <w:t xml:space="preserve">qui </w:t>
+      </w:r>
+      <w:r>
+        <w:rPr>
+          <w:rFonts w:ascii="Calibri" w:hAnsi="Calibri" w:cs="Calibri"/>
+        </w:rPr>
+        <w:t>est un module intégré à la bibliothèque standard de Python permettant de créer des interfaces graphiques</w:t>
+      </w:r>
+      <w:r>
+        <w:rPr>
+          <w:rFonts w:ascii="Calibri" w:hAnsi="Calibri" w:cs="Calibri"/>
+        </w:rPr>
+        <w:t xml:space="preserve"> cela va nous être utile pour la création de l’interface de l’application ainsi que tout les boutons / formulaires pour les options / les prénoms des personnes.</w:t>
+      </w:r>
+      <w:r>
+        <w:rPr>
+          <w:rFonts w:ascii="Calibri" w:hAnsi="Calibri" w:cs="Calibri"/>
+        </w:rPr>
+        <w:t xml:space="preserve"> </w:t>
+      </w:r>
+    </w:p>
+    <w:p>
+      <w:pPr>
+        <w:rPr>
+          <w:rFonts w:ascii="Calibri" w:hAnsi="Calibri" w:cs="Calibri"/>
+        </w:rPr>
+      </w:pPr>
+    </w:p>
+    <w:p>
+      <w:pPr>
+        <w:rPr>
+          <w:rFonts w:ascii="Calibri" w:hAnsi="Calibri" w:cs="Calibri"/>
+        </w:rPr>
+      </w:pPr>
+      <w:r>
+        <w:rPr>
+          <w:rFonts w:ascii="Calibri" w:hAnsi="Calibri" w:cs="Calibri"/>
+        </w:rPr>
+        <w:t>[Intégration continue / suivit de projet]</w:t>
+      </w:r>
+    </w:p>
+    <w:p>
+      <w:pPr>
+        <w:rPr>
+          <w:rFonts w:ascii="Calibri" w:hAnsi="Calibri" w:cs="Calibri"/>
+        </w:rPr>
+      </w:pPr>
+      <w:r>
+        <w:rPr>
+          <w:rFonts w:ascii="Calibri" w:hAnsi="Calibri" w:cs="Calibri"/>
+        </w:rPr>
+        <w:t xml:space="preserve">Pour l’intégration continue nous utilisons </w:t>
+      </w:r>
+      <w:proofErr w:type="spellStart"/>
+      <w:r>
+        <w:rPr>
+          <w:rFonts w:ascii="Calibri" w:hAnsi="Calibri" w:cs="Calibri"/>
+        </w:rPr>
+        <w:t>Github</w:t>
+      </w:r>
+      <w:proofErr w:type="spellEnd"/>
+      <w:r>
+        <w:rPr>
+          <w:rFonts w:ascii="Calibri" w:hAnsi="Calibri" w:cs="Calibri"/>
+        </w:rPr>
+        <w:t>.</w:t>
+      </w:r>
+      <w:r>
+        <w:rPr>
+          <w:rFonts w:ascii="Calibri" w:hAnsi="Calibri" w:cs="Calibri"/>
+        </w:rPr>
+        <w:t xml:space="preserve"> </w:t>
+      </w:r>
+      <w:r>
+        <w:rPr>
+          <w:rFonts w:ascii="Calibri" w:hAnsi="Calibri" w:cs="Calibri"/>
+        </w:rPr>
+        <w:t>Le projet est disponible sur ce lien :</w:t>
+      </w:r>
+      <w:r>
+        <w:t xml:space="preserve"> </w:t>
+      </w:r>
+      <w:hyperlink r:id="rId6" w:history="1">
+        <w:r>
+          <w:rPr>
+            <w:rStyle w:val="Lienhypertexte"/>
+            <w:rFonts w:ascii="Calibri" w:hAnsi="Calibri" w:cs="Calibri"/>
+          </w:rPr>
+          <w:t>https://github.com/Bahmohamedhabib/projetcapi</w:t>
+        </w:r>
+      </w:hyperlink>
+      <w:r>
+        <w:rPr>
+          <w:rFonts w:ascii="Calibri" w:hAnsi="Calibri" w:cs="Calibri"/>
+        </w:rPr>
+        <w:t xml:space="preserve"> </w:t>
+      </w:r>
+    </w:p>
+    <w:p>
+      <w:pPr>
+        <w:rPr>
+          <w:rFonts w:ascii="Calibri" w:hAnsi="Calibri" w:cs="Calibri"/>
+        </w:rPr>
+      </w:pPr>
+      <w:r>
+        <w:rPr>
+          <w:rFonts w:ascii="Calibri" w:hAnsi="Calibri" w:cs="Calibri"/>
+        </w:rPr>
+        <w:t xml:space="preserve">Pour le suivit de projet nous avons utiliser le logiciel </w:t>
+      </w:r>
+      <w:proofErr w:type="spellStart"/>
+      <w:r>
+        <w:rPr>
+          <w:rFonts w:ascii="Calibri" w:hAnsi="Calibri" w:cs="Calibri"/>
+        </w:rPr>
+        <w:t>gantt</w:t>
+      </w:r>
+      <w:proofErr w:type="spellEnd"/>
+      <w:r>
+        <w:rPr>
+          <w:rFonts w:ascii="Calibri" w:hAnsi="Calibri" w:cs="Calibri"/>
+        </w:rPr>
+        <w:t xml:space="preserve"> qui est un outil de gestion de projet pour suivre les différent</w:t>
+      </w:r>
+      <w:r>
+        <w:rPr>
+          <w:rFonts w:ascii="Calibri" w:hAnsi="Calibri" w:cs="Calibri"/>
+        </w:rPr>
+        <w:t xml:space="preserve">es parties d’avancements dans le projet. Voici le diagramme de </w:t>
+      </w:r>
+      <w:proofErr w:type="spellStart"/>
+      <w:r>
+        <w:rPr>
+          <w:rFonts w:ascii="Calibri" w:hAnsi="Calibri" w:cs="Calibri"/>
+        </w:rPr>
+        <w:t>gantt</w:t>
+      </w:r>
+      <w:proofErr w:type="spellEnd"/>
+      <w:r>
+        <w:rPr>
+          <w:rFonts w:ascii="Calibri" w:hAnsi="Calibri" w:cs="Calibri"/>
+        </w:rPr>
+        <w:t xml:space="preserve"> ci-dessous :</w:t>
+      </w:r>
+    </w:p>
+    <w:p>
+      <w:pPr>
+        <w:rPr>
+          <w:rFonts w:ascii="Calibri" w:hAnsi="Calibri" w:cs="Calibri"/>
+        </w:rPr>
+      </w:pPr>
+    </w:p>
+    <w:p>
+      <w:pPr>
+        <w:rPr>
+          <w:rFonts w:ascii="Calibri" w:hAnsi="Calibri" w:cs="Calibri"/>
+        </w:rPr>
+      </w:pPr>
+    </w:p>
+    <w:p>
+      <w:pPr>
+        <w:rPr>
+          <w:rFonts w:ascii="Calibri" w:hAnsi="Calibri" w:cs="Calibri"/>
+        </w:rPr>
+      </w:pPr>
+    </w:p>
+    <w:p>
+      <w:pPr>
+        <w:rPr>
+          <w:rFonts w:ascii="Calibri" w:hAnsi="Calibri" w:cs="Calibri"/>
+        </w:rPr>
+      </w:pPr>
+    </w:p>
+    <w:p>
+      <w:pPr>
+        <w:rPr>
+          <w:rFonts w:ascii="Calibri" w:hAnsi="Calibri" w:cs="Calibri"/>
+        </w:rPr>
+      </w:pPr>
+    </w:p>
+    <w:p>
+      <w:pPr>
+        <w:rPr>
+          <w:rFonts w:ascii="Calibri" w:hAnsi="Calibri" w:cs="Calibri"/>
+        </w:rPr>
+      </w:pPr>
+    </w:p>
+    <w:p>
+      <w:pPr>
+        <w:rPr>
+          <w:rFonts w:ascii="Calibri" w:hAnsi="Calibri" w:cs="Calibri"/>
+        </w:rPr>
+      </w:pPr>
+    </w:p>
+    <w:p>
+      <w:pPr>
+        <w:rPr>
+          <w:rFonts w:ascii="Calibri" w:hAnsi="Calibri" w:cs="Calibri"/>
+        </w:rPr>
+      </w:pPr>
+    </w:p>
+    <w:p>
+      <w:pPr>
+        <w:rPr>
+          <w:rFonts w:ascii="Calibri" w:hAnsi="Calibri" w:cs="Calibri"/>
+        </w:rPr>
+      </w:pPr>
+    </w:p>
     <w:sectPr>
       <w:pgSz w:w="11906" w:h="16838"/>
       <w:pgMar w:top="1417" w:right="1417" w:bottom="1417" w:left="1417" w:header="708" w:footer="708" w:gutter="0"/>
@@ -11,6 +801,278 @@
     </w:sectPr>
   </w:body>
 </w:document>
+</file>
+
+<file path=word/numbering.xml><?xml version="1.0" encoding="utf-8"?>
+<w:numbering xmlns:wpc="http://schemas.microsoft.com/office/word/2010/wordprocessingCanvas" xmlns:cx="http://schemas.microsoft.com/office/drawing/2014/chartex" xmlns:cx1="http://schemas.microsoft.com/office/drawing/2015/9/8/chartex" xmlns:cx2="http://schemas.microsoft.com/office/drawing/2015/10/21/chartex" xmlns:cx3="http://schemas.microsoft.com/office/drawing/2016/5/9/chartex" xmlns:cx4="http://schemas.microsoft.com/office/drawing/2016/5/10/chartex" xmlns:cx5="http://schemas.microsoft.com/office/drawing/2016/5/11/chartex" xmlns:cx6="http://schemas.microsoft.com/office/drawing/2016/5/12/chartex" xmlns:cx7="http://schemas.microsoft.com/office/drawing/2016/5/13/chartex" xmlns:cx8="http://schemas.microsoft.com/office/drawing/2016/5/14/chartex" xmlns:mc="http://schemas.openxmlformats.org/markup-compatibility/2006" xmlns:aink="http://schemas.microsoft.com/office/drawing/2016/ink" xmlns:am3d="http://schemas.microsoft.com/office/drawing/2017/model3d" xmlns:o="urn:schemas-microsoft-com:office:office" xmlns:r="http://schemas.openxmlformats.org/officeDocument/2006/relationships" xmlns:m="http://schemas.openxmlformats.org/officeDocument/2006/math" xmlns:v="urn:schemas-microsoft-com:vml" xmlns:wp14="http://schemas.microsoft.com/office/word/2010/wordprocessingDrawing" xmlns:wp="http://schemas.openxmlformats.org/drawingml/2006/wordprocessingDrawing" xmlns:w10="urn:schemas-microsoft-com:office:word" xmlns:w="http://schemas.openxmlformats.org/wordprocessingml/2006/main" xmlns:w14="http://schemas.microsoft.com/office/word/2010/wordml" xmlns:w15="http://schemas.microsoft.com/office/word/2012/wordml" xmlns:w16cex="http://schemas.microsoft.com/office/word/2018/wordml/cex" xmlns:w16cid="http://schemas.microsoft.com/office/word/2016/wordml/cid" xmlns:w16="http://schemas.microsoft.com/office/word/2018/wordml" xmlns:w16sdtdh="http://schemas.microsoft.com/office/word/2020/wordml/sdtdatahash" xmlns:w16se="http://schemas.microsoft.com/office/word/2015/wordml/symex" xmlns:wpg="http://schemas.microsoft.com/office/word/2010/wordprocessingGroup" xmlns:wpi="http://schemas.microsoft.com/office/word/2010/wordprocessingInk" xmlns:wne="http://schemas.microsoft.com/office/word/2006/wordml" xmlns:wps="http://schemas.microsoft.com/office/word/2010/wordprocessingShape" mc:Ignorable="w14 w15 w16se w16cid w16 w16cex w16sdtdh wp14">
+  <w:abstractNum w:abstractNumId="0" w15:restartNumberingAfterBreak="0">
+    <w:nsid w:val="16C52777"/>
+    <w:multiLevelType w:val="multilevel"/>
+    <w:tmpl w:val="8544EE7E"/>
+    <w:lvl w:ilvl="0">
+      <w:start w:val="1"/>
+      <w:numFmt w:val="bullet"/>
+      <w:lvlText w:val=""/>
+      <w:lvlJc w:val="left"/>
+      <w:pPr>
+        <w:tabs>
+          <w:tab w:val="num" w:pos="720"/>
+        </w:tabs>
+        <w:ind w:left="720" w:hanging="360"/>
+      </w:pPr>
+      <w:rPr>
+        <w:rFonts w:ascii="Symbol" w:hAnsi="Symbol" w:hint="default"/>
+        <w:sz w:val="20"/>
+      </w:rPr>
+    </w:lvl>
+    <w:lvl w:ilvl="1" w:tentative="1">
+      <w:start w:val="1"/>
+      <w:numFmt w:val="bullet"/>
+      <w:lvlText w:val="o"/>
+      <w:lvlJc w:val="left"/>
+      <w:pPr>
+        <w:tabs>
+          <w:tab w:val="num" w:pos="1440"/>
+        </w:tabs>
+        <w:ind w:left="1440" w:hanging="360"/>
+      </w:pPr>
+      <w:rPr>
+        <w:rFonts w:ascii="Courier New" w:hAnsi="Courier New" w:hint="default"/>
+        <w:sz w:val="20"/>
+      </w:rPr>
+    </w:lvl>
+    <w:lvl w:ilvl="2" w:tentative="1">
+      <w:start w:val="1"/>
+      <w:numFmt w:val="bullet"/>
+      <w:lvlText w:val=""/>
+      <w:lvlJc w:val="left"/>
+      <w:pPr>
+        <w:tabs>
+          <w:tab w:val="num" w:pos="2160"/>
+        </w:tabs>
+        <w:ind w:left="2160" w:hanging="360"/>
+      </w:pPr>
+      <w:rPr>
+        <w:rFonts w:ascii="Wingdings" w:hAnsi="Wingdings" w:hint="default"/>
+        <w:sz w:val="20"/>
+      </w:rPr>
+    </w:lvl>
+    <w:lvl w:ilvl="3" w:tentative="1">
+      <w:start w:val="1"/>
+      <w:numFmt w:val="bullet"/>
+      <w:lvlText w:val=""/>
+      <w:lvlJc w:val="left"/>
+      <w:pPr>
+        <w:tabs>
+          <w:tab w:val="num" w:pos="2880"/>
+        </w:tabs>
+        <w:ind w:left="2880" w:hanging="360"/>
+      </w:pPr>
+      <w:rPr>
+        <w:rFonts w:ascii="Wingdings" w:hAnsi="Wingdings" w:hint="default"/>
+        <w:sz w:val="20"/>
+      </w:rPr>
+    </w:lvl>
+    <w:lvl w:ilvl="4" w:tentative="1">
+      <w:start w:val="1"/>
+      <w:numFmt w:val="bullet"/>
+      <w:lvlText w:val=""/>
+      <w:lvlJc w:val="left"/>
+      <w:pPr>
+        <w:tabs>
+          <w:tab w:val="num" w:pos="3600"/>
+        </w:tabs>
+        <w:ind w:left="3600" w:hanging="360"/>
+      </w:pPr>
+      <w:rPr>
+        <w:rFonts w:ascii="Wingdings" w:hAnsi="Wingdings" w:hint="default"/>
+        <w:sz w:val="20"/>
+      </w:rPr>
+    </w:lvl>
+    <w:lvl w:ilvl="5" w:tentative="1">
+      <w:start w:val="1"/>
+      <w:numFmt w:val="bullet"/>
+      <w:lvlText w:val=""/>
+      <w:lvlJc w:val="left"/>
+      <w:pPr>
+        <w:tabs>
+          <w:tab w:val="num" w:pos="4320"/>
+        </w:tabs>
+        <w:ind w:left="4320" w:hanging="360"/>
+      </w:pPr>
+      <w:rPr>
+        <w:rFonts w:ascii="Wingdings" w:hAnsi="Wingdings" w:hint="default"/>
+        <w:sz w:val="20"/>
+      </w:rPr>
+    </w:lvl>
+    <w:lvl w:ilvl="6" w:tentative="1">
+      <w:start w:val="1"/>
+      <w:numFmt w:val="bullet"/>
+      <w:lvlText w:val=""/>
+      <w:lvlJc w:val="left"/>
+      <w:pPr>
+        <w:tabs>
+          <w:tab w:val="num" w:pos="5040"/>
+        </w:tabs>
+        <w:ind w:left="5040" w:hanging="360"/>
+      </w:pPr>
+      <w:rPr>
+        <w:rFonts w:ascii="Wingdings" w:hAnsi="Wingdings" w:hint="default"/>
+        <w:sz w:val="20"/>
+      </w:rPr>
+    </w:lvl>
+    <w:lvl w:ilvl="7" w:tentative="1">
+      <w:start w:val="1"/>
+      <w:numFmt w:val="bullet"/>
+      <w:lvlText w:val=""/>
+      <w:lvlJc w:val="left"/>
+      <w:pPr>
+        <w:tabs>
+          <w:tab w:val="num" w:pos="5760"/>
+        </w:tabs>
+        <w:ind w:left="5760" w:hanging="360"/>
+      </w:pPr>
+      <w:rPr>
+        <w:rFonts w:ascii="Wingdings" w:hAnsi="Wingdings" w:hint="default"/>
+        <w:sz w:val="20"/>
+      </w:rPr>
+    </w:lvl>
+    <w:lvl w:ilvl="8" w:tentative="1">
+      <w:start w:val="1"/>
+      <w:numFmt w:val="bullet"/>
+      <w:lvlText w:val=""/>
+      <w:lvlJc w:val="left"/>
+      <w:pPr>
+        <w:tabs>
+          <w:tab w:val="num" w:pos="6480"/>
+        </w:tabs>
+        <w:ind w:left="6480" w:hanging="360"/>
+      </w:pPr>
+      <w:rPr>
+        <w:rFonts w:ascii="Wingdings" w:hAnsi="Wingdings" w:hint="default"/>
+        <w:sz w:val="20"/>
+      </w:rPr>
+    </w:lvl>
+  </w:abstractNum>
+  <w:abstractNum w:abstractNumId="1" w15:restartNumberingAfterBreak="0">
+    <w:nsid w:val="58F92093"/>
+    <w:multiLevelType w:val="hybridMultilevel"/>
+    <w:tmpl w:val="C944D54E"/>
+    <w:lvl w:ilvl="0" w:tplc="998C0B7A">
+      <w:numFmt w:val="bullet"/>
+      <w:lvlText w:val="-"/>
+      <w:lvlJc w:val="left"/>
+      <w:pPr>
+        <w:ind w:left="720" w:hanging="360"/>
+      </w:pPr>
+      <w:rPr>
+        <w:rFonts w:ascii="Calibri" w:eastAsiaTheme="minorHAnsi" w:hAnsi="Calibri" w:cs="Calibri" w:hint="default"/>
+      </w:rPr>
+    </w:lvl>
+    <w:lvl w:ilvl="1" w:tplc="040C0003" w:tentative="1">
+      <w:start w:val="1"/>
+      <w:numFmt w:val="bullet"/>
+      <w:lvlText w:val="o"/>
+      <w:lvlJc w:val="left"/>
+      <w:pPr>
+        <w:ind w:left="1440" w:hanging="360"/>
+      </w:pPr>
+      <w:rPr>
+        <w:rFonts w:ascii="Courier New" w:hAnsi="Courier New" w:cs="Courier New" w:hint="default"/>
+      </w:rPr>
+    </w:lvl>
+    <w:lvl w:ilvl="2" w:tplc="040C0005" w:tentative="1">
+      <w:start w:val="1"/>
+      <w:numFmt w:val="bullet"/>
+      <w:lvlText w:val=""/>
+      <w:lvlJc w:val="left"/>
+      <w:pPr>
+        <w:ind w:left="2160" w:hanging="360"/>
+      </w:pPr>
+      <w:rPr>
+        <w:rFonts w:ascii="Wingdings" w:hAnsi="Wingdings" w:hint="default"/>
+      </w:rPr>
+    </w:lvl>
+    <w:lvl w:ilvl="3" w:tplc="040C0001" w:tentative="1">
+      <w:start w:val="1"/>
+      <w:numFmt w:val="bullet"/>
+      <w:lvlText w:val=""/>
+      <w:lvlJc w:val="left"/>
+      <w:pPr>
+        <w:ind w:left="2880" w:hanging="360"/>
+      </w:pPr>
+      <w:rPr>
+        <w:rFonts w:ascii="Symbol" w:hAnsi="Symbol" w:hint="default"/>
+      </w:rPr>
+    </w:lvl>
+    <w:lvl w:ilvl="4" w:tplc="040C0003" w:tentative="1">
+      <w:start w:val="1"/>
+      <w:numFmt w:val="bullet"/>
+      <w:lvlText w:val="o"/>
+      <w:lvlJc w:val="left"/>
+      <w:pPr>
+        <w:ind w:left="3600" w:hanging="360"/>
+      </w:pPr>
+      <w:rPr>
+        <w:rFonts w:ascii="Courier New" w:hAnsi="Courier New" w:cs="Courier New" w:hint="default"/>
+      </w:rPr>
+    </w:lvl>
+    <w:lvl w:ilvl="5" w:tplc="040C0005" w:tentative="1">
+      <w:start w:val="1"/>
+      <w:numFmt w:val="bullet"/>
+      <w:lvlText w:val=""/>
+      <w:lvlJc w:val="left"/>
+      <w:pPr>
+        <w:ind w:left="4320" w:hanging="360"/>
+      </w:pPr>
+      <w:rPr>
+        <w:rFonts w:ascii="Wingdings" w:hAnsi="Wingdings" w:hint="default"/>
+      </w:rPr>
+    </w:lvl>
+    <w:lvl w:ilvl="6" w:tplc="040C0001" w:tentative="1">
+      <w:start w:val="1"/>
+      <w:numFmt w:val="bullet"/>
+      <w:lvlText w:val=""/>
+      <w:lvlJc w:val="left"/>
+      <w:pPr>
+        <w:ind w:left="5040" w:hanging="360"/>
+      </w:pPr>
+      <w:rPr>
+        <w:rFonts w:ascii="Symbol" w:hAnsi="Symbol" w:hint="default"/>
+      </w:rPr>
+    </w:lvl>
+    <w:lvl w:ilvl="7" w:tplc="040C0003" w:tentative="1">
+      <w:start w:val="1"/>
+      <w:numFmt w:val="bullet"/>
+      <w:lvlText w:val="o"/>
+      <w:lvlJc w:val="left"/>
+      <w:pPr>
+        <w:ind w:left="5760" w:hanging="360"/>
+      </w:pPr>
+      <w:rPr>
+        <w:rFonts w:ascii="Courier New" w:hAnsi="Courier New" w:cs="Courier New" w:hint="default"/>
+      </w:rPr>
+    </w:lvl>
+    <w:lvl w:ilvl="8" w:tplc="040C0005" w:tentative="1">
+      <w:start w:val="1"/>
+      <w:numFmt w:val="bullet"/>
+      <w:lvlText w:val=""/>
+      <w:lvlJc w:val="left"/>
+      <w:pPr>
+        <w:ind w:left="6480" w:hanging="360"/>
+      </w:pPr>
+      <w:rPr>
+        <w:rFonts w:ascii="Wingdings" w:hAnsi="Wingdings" w:hint="default"/>
+      </w:rPr>
+    </w:lvl>
+  </w:abstractNum>
+  <w:num w:numId="1">
+    <w:abstractNumId w:val="1"/>
+  </w:num>
+  <w:num w:numId="2">
+    <w:abstractNumId w:val="0"/>
+  </w:num>
+</w:numbering>
 </file>
 
 <file path=word/styles.xml><?xml version="1.0" encoding="utf-8"?>
@@ -439,6 +1501,40 @@
     <w:semiHidden/>
     <w:unhideWhenUsed/>
   </w:style>
+  <w:style w:type="paragraph" w:styleId="Paragraphedeliste">
+    <w:name w:val="List Paragraph"/>
+    <w:basedOn w:val="Normal"/>
+    <w:uiPriority w:val="34"/>
+    <w:qFormat/>
+    <w:rsid w:val="00D75EFC"/>
+    <w:pPr>
+      <w:ind w:left="720"/>
+      <w:contextualSpacing/>
+    </w:pPr>
+  </w:style>
+  <w:style w:type="character" w:styleId="Lienhypertexte">
+    <w:name w:val="Hyperlink"/>
+    <w:basedOn w:val="Policepardfaut"/>
+    <w:uiPriority w:val="99"/>
+    <w:unhideWhenUsed/>
+    <w:rsid w:val="00CD3ADC"/>
+    <w:rPr>
+      <w:color w:val="0563C1" w:themeColor="hyperlink"/>
+      <w:u w:val="single"/>
+    </w:rPr>
+  </w:style>
+  <w:style w:type="character" w:styleId="Mentionnonrsolue">
+    <w:name w:val="Unresolved Mention"/>
+    <w:basedOn w:val="Policepardfaut"/>
+    <w:uiPriority w:val="99"/>
+    <w:semiHidden/>
+    <w:unhideWhenUsed/>
+    <w:rsid w:val="00CD3ADC"/>
+    <w:rPr>
+      <w:color w:val="605E5C"/>
+      <w:shd w:val="clear" w:color="auto" w:fill="E1DFDD"/>
+    </w:rPr>
+  </w:style>
 </w:styles>
 </file>
 

</xml_diff>